<commit_message>
Click to see changes
</commit_message>
<xml_diff>
--- a/32IV Inzhenerija vbudovanyh/1/KNT-122_Onyshchenko_Variant-19_PR1.docx
+++ b/32IV Inzhenerija vbudovanyh/1/KNT-122_Onyshchenko_Variant-19_PR1.docx
@@ -133,7 +133,13 @@
         <w:t xml:space="preserve"> </w:t>
       </w:r>
       <w:r>
-        <w:t>«»</w:t>
+        <w:t>«</w:t>
+      </w:r>
+      <w:r>
+        <w:t>Інженерія програмного забезпечення вбудованих систем</w:t>
+      </w:r>
+      <w:r>
+        <w:t>»</w:t>
       </w:r>
     </w:p>
     <w:p>
@@ -144,6 +150,9 @@
       </w:pPr>
       <w:r>
         <w:t>Робота №</w:t>
+      </w:r>
+      <w:r>
+        <w:t>1</w:t>
       </w:r>
     </w:p>
     <w:p>

</xml_diff>